<commit_message>
Update the syllabus to the Fall 2026 revision
New topics and readings for all twelve weeks. Five weeks change title,
including week 4 to Feedback and week 10 to Machine Decision is Not Final.
Weeks 9 to 12 now carry a lab topic instead of TBD.

Co-Authored-By: Claude Opus 5 <noreply@anthropic.com>
</commit_message>
<xml_diff>
--- a/lab-planning/Pandaemonium-Architecture-6.0-Syllabus-Fall-2026.docx
+++ b/lab-planning/Pandaemonium-Architecture-6.0-Syllabus-Fall-2026.docx
@@ -545,7 +545,49 @@
           <w:sz w:val="21"/>
           <w:szCs w:val="21"/>
         </w:rPr>
-        <w:t xml:space="preserve">TBD — generative/toy AI: Golly, Koan to Wotja, et al; latent diffusion models and transformers: “toy AIs” to LLMs, diffusion models, world models</w:t>
+        <w:t xml:space="preserve">Topic: What’s in the box?</w:t>
+      </w:r>
+    </w:p>
+    <w:p>
+      <w:pPr>
+        <w:pBdr>
+          <w:top w:val="single" w:color="BBBBBB" w:sz="2" w:space="10"/>
+          <w:bottom w:val="single" w:color="BBBBBB" w:sz="2" w:space="10"/>
+          <w:left w:val="single" w:color="BBBBBB" w:sz="2" w:space="12"/>
+          <w:right w:val="single" w:color="BBBBBB" w:sz="2" w:space="12"/>
+        </w:pBdr>
+        <w:shd w:fill="F2F2F2" w:color="auto" w:val="clear"/>
+        <w:spacing w:after="120" w:line="300"/>
+      </w:pPr>
+      <w:r>
+        <w:rPr>
+          <w:rFonts w:ascii="Georgia" w:cs="Georgia" w:eastAsia="Georgia" w:hAnsi="Georgia"/>
+          <w:color w:val="1A1A1A"/>
+          <w:sz w:val="21"/>
+          <w:szCs w:val="21"/>
+        </w:rPr>
+        <w:t xml:space="preserve">Scott: generative/toy AI: Golly, Koan to Wotja, et al.</w:t>
+      </w:r>
+    </w:p>
+    <w:p>
+      <w:pPr>
+        <w:pBdr>
+          <w:top w:val="single" w:color="BBBBBB" w:sz="2" w:space="10"/>
+          <w:bottom w:val="single" w:color="BBBBBB" w:sz="2" w:space="10"/>
+          <w:left w:val="single" w:color="BBBBBB" w:sz="2" w:space="12"/>
+          <w:right w:val="single" w:color="BBBBBB" w:sz="2" w:space="12"/>
+        </w:pBdr>
+        <w:shd w:fill="F2F2F2" w:color="auto" w:val="clear"/>
+        <w:spacing w:after="120" w:line="300"/>
+      </w:pPr>
+      <w:r>
+        <w:rPr>
+          <w:rFonts w:ascii="Georgia" w:cs="Georgia" w:eastAsia="Georgia" w:hAnsi="Georgia"/>
+          <w:color w:val="1A1A1A"/>
+          <w:sz w:val="21"/>
+          <w:szCs w:val="21"/>
+        </w:rPr>
+        <w:t xml:space="preserve">Ariel: Monty Hall problem, sampling, autoregressive models, latent diffusion models</w:t>
       </w:r>
     </w:p>
     <w:p>
@@ -1013,7 +1055,70 @@
           <w:sz w:val="21"/>
           <w:szCs w:val="21"/>
         </w:rPr>
-        <w:t xml:space="preserve">TBD — introduction to Claude, GitHub, Hugging Face, et al</w:t>
+        <w:t xml:space="preserve">Topic: Applied Autopoiesis</w:t>
+      </w:r>
+    </w:p>
+    <w:p>
+      <w:pPr>
+        <w:pBdr>
+          <w:top w:val="single" w:color="BBBBBB" w:sz="2" w:space="10"/>
+          <w:bottom w:val="single" w:color="BBBBBB" w:sz="2" w:space="10"/>
+          <w:left w:val="single" w:color="BBBBBB" w:sz="2" w:space="12"/>
+          <w:right w:val="single" w:color="BBBBBB" w:sz="2" w:space="12"/>
+        </w:pBdr>
+        <w:shd w:fill="F2F2F2" w:color="auto" w:val="clear"/>
+        <w:spacing w:after="120" w:line="300"/>
+      </w:pPr>
+      <w:r>
+        <w:rPr>
+          <w:rFonts w:ascii="Georgia" w:cs="Georgia" w:eastAsia="Georgia" w:hAnsi="Georgia"/>
+          <w:color w:val="1A1A1A"/>
+          <w:sz w:val="21"/>
+          <w:szCs w:val="21"/>
+        </w:rPr>
+        <w:t xml:space="preserve">Vibe coding introduction: Codec app; Github</w:t>
+      </w:r>
+    </w:p>
+    <w:p>
+      <w:pPr>
+        <w:pBdr>
+          <w:top w:val="single" w:color="BBBBBB" w:sz="2" w:space="10"/>
+          <w:bottom w:val="single" w:color="BBBBBB" w:sz="2" w:space="10"/>
+          <w:left w:val="single" w:color="BBBBBB" w:sz="2" w:space="12"/>
+          <w:right w:val="single" w:color="BBBBBB" w:sz="2" w:space="12"/>
+        </w:pBdr>
+        <w:shd w:fill="F2F2F2" w:color="auto" w:val="clear"/>
+        <w:spacing w:after="120" w:line="300"/>
+      </w:pPr>
+      <w:r>
+        <w:rPr>
+          <w:rFonts w:ascii="Georgia" w:cs="Georgia" w:eastAsia="Georgia" w:hAnsi="Georgia"/>
+          <w:color w:val="1A1A1A"/>
+          <w:sz w:val="21"/>
+          <w:szCs w:val="21"/>
+        </w:rPr>
+        <w:t xml:space="preserve">HuggingFace, Fal.ai</w:t>
+      </w:r>
+    </w:p>
+    <w:p>
+      <w:pPr>
+        <w:pBdr>
+          <w:top w:val="single" w:color="BBBBBB" w:sz="2" w:space="10"/>
+          <w:bottom w:val="single" w:color="BBBBBB" w:sz="2" w:space="10"/>
+          <w:left w:val="single" w:color="BBBBBB" w:sz="2" w:space="12"/>
+          <w:right w:val="single" w:color="BBBBBB" w:sz="2" w:space="12"/>
+        </w:pBdr>
+        <w:shd w:fill="F2F2F2" w:color="auto" w:val="clear"/>
+        <w:spacing w:after="120" w:line="300"/>
+      </w:pPr>
+      <w:r>
+        <w:rPr>
+          <w:rFonts w:ascii="Georgia" w:cs="Georgia" w:eastAsia="Georgia" w:hAnsi="Georgia"/>
+          <w:color w:val="1A1A1A"/>
+          <w:sz w:val="21"/>
+          <w:szCs w:val="21"/>
+        </w:rPr>
+        <w:t xml:space="preserve">ComfyUI, Fuser, Krea, Higgsfield</w:t>
       </w:r>
     </w:p>
     <w:p>
@@ -1663,7 +1768,91 @@
           <w:sz w:val="21"/>
           <w:szCs w:val="21"/>
         </w:rPr>
-        <w:t xml:space="preserve">TBD — LLMs, coding with LLMs</w:t>
+        <w:t xml:space="preserve">Topic: Fitting frequencies — computer perception and aesthetics</w:t>
+      </w:r>
+    </w:p>
+    <w:p>
+      <w:pPr>
+        <w:pBdr>
+          <w:top w:val="single" w:color="BBBBBB" w:sz="2" w:space="10"/>
+          <w:bottom w:val="single" w:color="BBBBBB" w:sz="2" w:space="10"/>
+          <w:left w:val="single" w:color="BBBBBB" w:sz="2" w:space="12"/>
+          <w:right w:val="single" w:color="BBBBBB" w:sz="2" w:space="12"/>
+        </w:pBdr>
+        <w:shd w:fill="F2F2F2" w:color="auto" w:val="clear"/>
+        <w:spacing w:after="120" w:line="300"/>
+      </w:pPr>
+      <w:r>
+        <w:rPr>
+          <w:rFonts w:ascii="Georgia" w:cs="Georgia" w:eastAsia="Georgia" w:hAnsi="Georgia"/>
+          <w:color w:val="1A1A1A"/>
+          <w:sz w:val="21"/>
+          <w:szCs w:val="21"/>
+        </w:rPr>
+        <w:t xml:space="preserve">Iman Malik</w:t>
+      </w:r>
+    </w:p>
+    <w:p>
+      <w:pPr>
+        <w:pBdr>
+          <w:top w:val="single" w:color="BBBBBB" w:sz="2" w:space="10"/>
+          <w:bottom w:val="single" w:color="BBBBBB" w:sz="2" w:space="10"/>
+          <w:left w:val="single" w:color="BBBBBB" w:sz="2" w:space="12"/>
+          <w:right w:val="single" w:color="BBBBBB" w:sz="2" w:space="12"/>
+        </w:pBdr>
+        <w:shd w:fill="F2F2F2" w:color="auto" w:val="clear"/>
+        <w:spacing w:after="120" w:line="300"/>
+      </w:pPr>
+      <w:r>
+        <w:rPr>
+          <w:rFonts w:ascii="Georgia" w:cs="Georgia" w:eastAsia="Georgia" w:hAnsi="Georgia"/>
+          <w:color w:val="1A1A1A"/>
+          <w:sz w:val="21"/>
+          <w:szCs w:val="21"/>
+        </w:rPr>
+        <w:t xml:space="preserve">Color</w:t>
+      </w:r>
+    </w:p>
+    <w:p>
+      <w:pPr>
+        <w:pBdr>
+          <w:top w:val="single" w:color="BBBBBB" w:sz="2" w:space="10"/>
+          <w:bottom w:val="single" w:color="BBBBBB" w:sz="2" w:space="10"/>
+          <w:left w:val="single" w:color="BBBBBB" w:sz="2" w:space="12"/>
+          <w:right w:val="single" w:color="BBBBBB" w:sz="2" w:space="12"/>
+        </w:pBdr>
+        <w:shd w:fill="F2F2F2" w:color="auto" w:val="clear"/>
+        <w:spacing w:after="120" w:line="300"/>
+      </w:pPr>
+      <w:r>
+        <w:rPr>
+          <w:rFonts w:ascii="Georgia" w:cs="Georgia" w:eastAsia="Georgia" w:hAnsi="Georgia"/>
+          <w:color w:val="1A1A1A"/>
+          <w:sz w:val="21"/>
+          <w:szCs w:val="21"/>
+        </w:rPr>
+        <w:t xml:space="preserve">Style, LoRAs</w:t>
+      </w:r>
+    </w:p>
+    <w:p>
+      <w:pPr>
+        <w:pBdr>
+          <w:top w:val="single" w:color="BBBBBB" w:sz="2" w:space="10"/>
+          <w:bottom w:val="single" w:color="BBBBBB" w:sz="2" w:space="10"/>
+          <w:left w:val="single" w:color="BBBBBB" w:sz="2" w:space="12"/>
+          <w:right w:val="single" w:color="BBBBBB" w:sz="2" w:space="12"/>
+        </w:pBdr>
+        <w:shd w:fill="F2F2F2" w:color="auto" w:val="clear"/>
+        <w:spacing w:after="120" w:line="300"/>
+      </w:pPr>
+      <w:r>
+        <w:rPr>
+          <w:rFonts w:ascii="Georgia" w:cs="Georgia" w:eastAsia="Georgia" w:hAnsi="Georgia"/>
+          <w:color w:val="1A1A1A"/>
+          <w:sz w:val="21"/>
+          <w:szCs w:val="21"/>
+        </w:rPr>
+        <w:t xml:space="preserve">Training LoRAs if time permits</w:t>
       </w:r>
     </w:p>
     <w:p>
@@ -2183,7 +2372,91 @@
           <w:sz w:val="21"/>
           <w:szCs w:val="21"/>
         </w:rPr>
-        <w:t xml:space="preserve">TBD</w:t>
+        <w:t xml:space="preserve">Topic: Lossmaxing</w:t>
+      </w:r>
+    </w:p>
+    <w:p>
+      <w:pPr>
+        <w:pBdr>
+          <w:top w:val="single" w:color="BBBBBB" w:sz="2" w:space="10"/>
+          <w:bottom w:val="single" w:color="BBBBBB" w:sz="2" w:space="10"/>
+          <w:left w:val="single" w:color="BBBBBB" w:sz="2" w:space="12"/>
+          <w:right w:val="single" w:color="BBBBBB" w:sz="2" w:space="12"/>
+        </w:pBdr>
+        <w:shd w:fill="F2F2F2" w:color="auto" w:val="clear"/>
+        <w:spacing w:after="120" w:line="300"/>
+      </w:pPr>
+      <w:r>
+        <w:rPr>
+          <w:rFonts w:ascii="Georgia" w:cs="Georgia" w:eastAsia="Georgia" w:hAnsi="Georgia"/>
+          <w:color w:val="1A1A1A"/>
+          <w:sz w:val="21"/>
+          <w:szCs w:val="21"/>
+        </w:rPr>
+        <w:t xml:space="preserve">Gradient descent + loss, cognitive displacement</w:t>
+      </w:r>
+    </w:p>
+    <w:p>
+      <w:pPr>
+        <w:pBdr>
+          <w:top w:val="single" w:color="BBBBBB" w:sz="2" w:space="10"/>
+          <w:bottom w:val="single" w:color="BBBBBB" w:sz="2" w:space="10"/>
+          <w:left w:val="single" w:color="BBBBBB" w:sz="2" w:space="12"/>
+          <w:right w:val="single" w:color="BBBBBB" w:sz="2" w:space="12"/>
+        </w:pBdr>
+        <w:shd w:fill="F2F2F2" w:color="auto" w:val="clear"/>
+        <w:spacing w:after="120" w:line="300"/>
+      </w:pPr>
+      <w:r>
+        <w:rPr>
+          <w:rFonts w:ascii="Georgia" w:cs="Georgia" w:eastAsia="Georgia" w:hAnsi="Georgia"/>
+          <w:color w:val="1A1A1A"/>
+          <w:sz w:val="21"/>
+          <w:szCs w:val="21"/>
+        </w:rPr>
+        <w:t xml:space="preserve">How do we plan? Where do we place effort and critical thought within automation?</w:t>
+      </w:r>
+    </w:p>
+    <w:p>
+      <w:pPr>
+        <w:pBdr>
+          <w:top w:val="single" w:color="BBBBBB" w:sz="2" w:space="10"/>
+          <w:bottom w:val="single" w:color="BBBBBB" w:sz="2" w:space="10"/>
+          <w:left w:val="single" w:color="BBBBBB" w:sz="2" w:space="12"/>
+          <w:right w:val="single" w:color="BBBBBB" w:sz="2" w:space="12"/>
+        </w:pBdr>
+        <w:shd w:fill="F2F2F2" w:color="auto" w:val="clear"/>
+        <w:spacing w:after="120" w:line="300"/>
+      </w:pPr>
+      <w:r>
+        <w:rPr>
+          <w:rFonts w:ascii="Georgia" w:cs="Georgia" w:eastAsia="Georgia" w:hAnsi="Georgia"/>
+          <w:color w:val="1A1A1A"/>
+          <w:sz w:val="21"/>
+          <w:szCs w:val="21"/>
+        </w:rPr>
+        <w:t xml:space="preserve">What do we need to do ourselves that supersedes optimization efficiency principles?</w:t>
+      </w:r>
+    </w:p>
+    <w:p>
+      <w:pPr>
+        <w:pBdr>
+          <w:top w:val="single" w:color="BBBBBB" w:sz="2" w:space="10"/>
+          <w:bottom w:val="single" w:color="BBBBBB" w:sz="2" w:space="10"/>
+          <w:left w:val="single" w:color="BBBBBB" w:sz="2" w:space="12"/>
+          <w:right w:val="single" w:color="BBBBBB" w:sz="2" w:space="12"/>
+        </w:pBdr>
+        <w:shd w:fill="F2F2F2" w:color="auto" w:val="clear"/>
+        <w:spacing w:after="120" w:line="300"/>
+      </w:pPr>
+      <w:r>
+        <w:rPr>
+          <w:rFonts w:ascii="Georgia" w:cs="Georgia" w:eastAsia="Georgia" w:hAnsi="Georgia"/>
+          <w:color w:val="1A1A1A"/>
+          <w:sz w:val="21"/>
+          <w:szCs w:val="21"/>
+        </w:rPr>
+        <w:t xml:space="preserve">Decision making</w:t>
       </w:r>
     </w:p>
     <w:p>
@@ -2264,6 +2537,22 @@
           <w:szCs w:val="21"/>
         </w:rPr>
         <w:t xml:space="preserve"/>
+      </w:r>
+    </w:p>
+    <w:p>
+      <w:pPr>
+        <w:spacing w:after="220" w:before="60" w:line="300"/>
+      </w:pPr>
+      <w:r>
+        <w:rPr>
+          <w:rFonts w:ascii="Georgia" w:cs="Georgia" w:eastAsia="Georgia" w:hAnsi="Georgia"/>
+          <w:i/>
+          <w:iCs/>
+          <w:color w:val="5A5A5A"/>
+          <w:sz w:val="20"/>
+          <w:szCs w:val="20"/>
+        </w:rPr>
+        <w:t xml:space="preserve">October 12 — No class (Indigenous People’s Day)</w:t>
       </w:r>
     </w:p>
     <w:p>
@@ -2589,7 +2878,49 @@
           <w:sz w:val="21"/>
           <w:szCs w:val="21"/>
         </w:rPr>
-        <w:t xml:space="preserve">TBD</w:t>
+        <w:t xml:space="preserve">Topic: Duct tape brain</w:t>
+      </w:r>
+    </w:p>
+    <w:p>
+      <w:pPr>
+        <w:pBdr>
+          <w:top w:val="single" w:color="BBBBBB" w:sz="2" w:space="10"/>
+          <w:bottom w:val="single" w:color="BBBBBB" w:sz="2" w:space="10"/>
+          <w:left w:val="single" w:color="BBBBBB" w:sz="2" w:space="12"/>
+          <w:right w:val="single" w:color="BBBBBB" w:sz="2" w:space="12"/>
+        </w:pBdr>
+        <w:shd w:fill="F2F2F2" w:color="auto" w:val="clear"/>
+        <w:spacing w:after="120" w:line="300"/>
+      </w:pPr>
+      <w:r>
+        <w:rPr>
+          <w:rFonts w:ascii="Georgia" w:cs="Georgia" w:eastAsia="Georgia" w:hAnsi="Georgia"/>
+          <w:color w:val="1A1A1A"/>
+          <w:sz w:val="21"/>
+          <w:szCs w:val="21"/>
+        </w:rPr>
+        <w:t xml:space="preserve">RAG, vector db</w:t>
+      </w:r>
+    </w:p>
+    <w:p>
+      <w:pPr>
+        <w:pBdr>
+          <w:top w:val="single" w:color="BBBBBB" w:sz="2" w:space="10"/>
+          <w:bottom w:val="single" w:color="BBBBBB" w:sz="2" w:space="10"/>
+          <w:left w:val="single" w:color="BBBBBB" w:sz="2" w:space="12"/>
+          <w:right w:val="single" w:color="BBBBBB" w:sz="2" w:space="12"/>
+        </w:pBdr>
+        <w:shd w:fill="F2F2F2" w:color="auto" w:val="clear"/>
+        <w:spacing w:after="120" w:line="300"/>
+      </w:pPr>
+      <w:r>
+        <w:rPr>
+          <w:rFonts w:ascii="Georgia" w:cs="Georgia" w:eastAsia="Georgia" w:hAnsi="Georgia"/>
+          <w:color w:val="1A1A1A"/>
+          <w:sz w:val="21"/>
+          <w:szCs w:val="21"/>
+        </w:rPr>
+        <w:t xml:space="preserve">Building bot personality and tools</w:t>
       </w:r>
     </w:p>
     <w:p>
@@ -2781,7 +3112,49 @@
           <w:sz w:val="21"/>
           <w:szCs w:val="21"/>
         </w:rPr>
-        <w:t xml:space="preserve">TBD</w:t>
+        <w:t xml:space="preserve">Topic: Post truth psychosis</w:t>
+      </w:r>
+    </w:p>
+    <w:p>
+      <w:pPr>
+        <w:pBdr>
+          <w:top w:val="single" w:color="BBBBBB" w:sz="2" w:space="10"/>
+          <w:bottom w:val="single" w:color="BBBBBB" w:sz="2" w:space="10"/>
+          <w:left w:val="single" w:color="BBBBBB" w:sz="2" w:space="12"/>
+          <w:right w:val="single" w:color="BBBBBB" w:sz="2" w:space="12"/>
+        </w:pBdr>
+        <w:shd w:fill="F2F2F2" w:color="auto" w:val="clear"/>
+        <w:spacing w:after="120" w:line="300"/>
+      </w:pPr>
+      <w:r>
+        <w:rPr>
+          <w:rFonts w:ascii="Georgia" w:cs="Georgia" w:eastAsia="Georgia" w:hAnsi="Georgia"/>
+          <w:color w:val="1A1A1A"/>
+          <w:sz w:val="21"/>
+          <w:szCs w:val="21"/>
+        </w:rPr>
+        <w:t xml:space="preserve">Hallucinations and repetition</w:t>
+      </w:r>
+    </w:p>
+    <w:p>
+      <w:pPr>
+        <w:pBdr>
+          <w:top w:val="single" w:color="BBBBBB" w:sz="2" w:space="10"/>
+          <w:bottom w:val="single" w:color="BBBBBB" w:sz="2" w:space="10"/>
+          <w:left w:val="single" w:color="BBBBBB" w:sz="2" w:space="12"/>
+          <w:right w:val="single" w:color="BBBBBB" w:sz="2" w:space="12"/>
+        </w:pBdr>
+        <w:shd w:fill="F2F2F2" w:color="auto" w:val="clear"/>
+        <w:spacing w:after="120" w:line="300"/>
+      </w:pPr>
+      <w:r>
+        <w:rPr>
+          <w:rFonts w:ascii="Georgia" w:cs="Georgia" w:eastAsia="Georgia" w:hAnsi="Georgia"/>
+          <w:color w:val="1A1A1A"/>
+          <w:sz w:val="21"/>
+          <w:szCs w:val="21"/>
+        </w:rPr>
+        <w:t xml:space="preserve">Doing research with AI</w:t>
       </w:r>
     </w:p>
     <w:p>
@@ -3197,7 +3570,49 @@
           <w:sz w:val="21"/>
           <w:szCs w:val="21"/>
         </w:rPr>
-        <w:t xml:space="preserve">Multi-dimensional data, t-SNE, word clouds</w:t>
+        <w:t xml:space="preserve">Topic: A word is worth a thousand numbers?</w:t>
+      </w:r>
+    </w:p>
+    <w:p>
+      <w:pPr>
+        <w:pBdr>
+          <w:top w:val="single" w:color="BBBBBB" w:sz="2" w:space="10"/>
+          <w:bottom w:val="single" w:color="BBBBBB" w:sz="2" w:space="10"/>
+          <w:left w:val="single" w:color="BBBBBB" w:sz="2" w:space="12"/>
+          <w:right w:val="single" w:color="BBBBBB" w:sz="2" w:space="12"/>
+        </w:pBdr>
+        <w:shd w:fill="F2F2F2" w:color="auto" w:val="clear"/>
+        <w:spacing w:after="120" w:line="300"/>
+      </w:pPr>
+      <w:r>
+        <w:rPr>
+          <w:rFonts w:ascii="Georgia" w:cs="Georgia" w:eastAsia="Georgia" w:hAnsi="Georgia"/>
+          <w:color w:val="1A1A1A"/>
+          <w:sz w:val="21"/>
+          <w:szCs w:val="21"/>
+        </w:rPr>
+        <w:t xml:space="preserve">Multi-dimensional data, t-SNE, word clouds, tokenization, embeddings, word2vec</w:t>
+      </w:r>
+    </w:p>
+    <w:p>
+      <w:pPr>
+        <w:pBdr>
+          <w:top w:val="single" w:color="BBBBBB" w:sz="2" w:space="10"/>
+          <w:bottom w:val="single" w:color="BBBBBB" w:sz="2" w:space="10"/>
+          <w:left w:val="single" w:color="BBBBBB" w:sz="2" w:space="12"/>
+          <w:right w:val="single" w:color="BBBBBB" w:sz="2" w:space="12"/>
+        </w:pBdr>
+        <w:shd w:fill="F2F2F2" w:color="auto" w:val="clear"/>
+        <w:spacing w:after="120" w:line="300"/>
+      </w:pPr>
+      <w:r>
+        <w:rPr>
+          <w:rFonts w:ascii="Georgia" w:cs="Georgia" w:eastAsia="Georgia" w:hAnsi="Georgia"/>
+          <w:color w:val="1A1A1A"/>
+          <w:sz w:val="21"/>
+          <w:szCs w:val="21"/>
+        </w:rPr>
+        <w:t xml:space="preserve">Psychology/biochemistry of memory and synaptic connections</w:t>
       </w:r>
     </w:p>
     <w:p>
@@ -3561,7 +3976,28 @@
           <w:sz w:val="21"/>
           <w:szCs w:val="21"/>
         </w:rPr>
-        <w:t xml:space="preserve">TBD</w:t>
+        <w:t xml:space="preserve">Topic: Fool me only once shame on you, fool me into randomness great job</w:t>
+      </w:r>
+    </w:p>
+    <w:p>
+      <w:pPr>
+        <w:pBdr>
+          <w:top w:val="single" w:color="BBBBBB" w:sz="2" w:space="10"/>
+          <w:bottom w:val="single" w:color="BBBBBB" w:sz="2" w:space="10"/>
+          <w:left w:val="single" w:color="BBBBBB" w:sz="2" w:space="12"/>
+          <w:right w:val="single" w:color="BBBBBB" w:sz="2" w:space="12"/>
+        </w:pBdr>
+        <w:shd w:fill="F2F2F2" w:color="auto" w:val="clear"/>
+        <w:spacing w:after="120" w:line="300"/>
+      </w:pPr>
+      <w:r>
+        <w:rPr>
+          <w:rFonts w:ascii="Georgia" w:cs="Georgia" w:eastAsia="Georgia" w:hAnsi="Georgia"/>
+          <w:color w:val="1A1A1A"/>
+          <w:sz w:val="21"/>
+          <w:szCs w:val="21"/>
+        </w:rPr>
+        <w:t xml:space="preserve">GANs, distillation</w:t>
       </w:r>
     </w:p>
     <w:p>

</xml_diff>